<commit_message>
Embed Charlene Odei Asare real portrait into Word document and letterhead press release
</commit_message>
<xml_diff>
--- a/FHUMSA_Press_Release_Charlene_Odei_Asare.docx
+++ b/FHUMSA_Press_Release_Charlene_Odei_Asare.docx
@@ -49,7 +49,7 @@
     </w:p>
     <w:p>
       <w:pPr>
-        <w:spacing w:after="240"/>
+        <w:spacing w:after="200"/>
         <w:jc w:val="center"/>
         <w:pBdr>
           <w:bottom w:val="single" w:sz="18" w:space="1" w:color="0D766E"/>
@@ -58,14 +58,14 @@
     </w:p>
     <w:p>
       <w:pPr>
-        <w:spacing w:after="280"/>
+        <w:spacing w:after="200"/>
       </w:pPr>
       <w:r>
         <w:rPr>
           <w:rFonts w:ascii="Arial" w:hAnsi="Arial"/>
           <w:b/>
           <w:color w:val="D97706"/>
-          <w:sz w:val="20"/>
+          <w:sz w:val="19"/>
         </w:rPr>
         <w:t>FOR IMMEDIATE RELEASE</w:t>
         <w:br/>
@@ -75,7 +75,7 @@
           <w:rFonts w:ascii="Arial" w:hAnsi="Arial"/>
           <w:b/>
           <w:color w:val="0F172A"/>
-          <w:sz w:val="19"/>
+          <w:sz w:val="18"/>
         </w:rPr>
         <w:t>DATE: August 2026</w:t>
         <w:br/>
@@ -84,9 +84,9 @@
         <w:rPr>
           <w:rFonts w:ascii="Arial" w:hAnsi="Arial"/>
           <w:color w:val="475569"/>
-          <w:sz w:val="19"/>
+          <w:sz w:val="18"/>
         </w:rPr>
-        <w:t>SUBJECT: Official Appreciation &amp; Post-Election Acceptance Statement</w:t>
+        <w:t>SUBJECT: Official Post-Election Appreciation &amp; Acceptance Statement</w:t>
         <w:br/>
         <w:t>ISSUED BY: Charlene Odei Asare, Financial Secretary — Elect</w:t>
         <w:br/>
@@ -94,7 +94,7 @@
     </w:p>
     <w:p>
       <w:pPr>
-        <w:spacing w:before="160" w:after="320"/>
+        <w:spacing w:before="80" w:after="280"/>
         <w:jc w:val="center"/>
       </w:pPr>
       <w:r>
@@ -107,48 +107,116 @@
         <w:t>WE DID IT: A MANDATE FOR SERVICE &amp; IMPACT</w:t>
       </w:r>
     </w:p>
+    <w:tbl>
+      <w:tblPr>
+        <w:tblW w:type="auto" w:w="0"/>
+        <w:jc w:val="center"/>
+        <w:tblLayout w:type="fixed"/>
+        <w:tblLook w:firstColumn="1" w:firstRow="1" w:lastColumn="0" w:lastRow="0" w:noHBand="0" w:noVBand="1" w:val="04A0"/>
+      </w:tblPr>
+      <w:tblGrid>
+        <w:gridCol w:w="4824"/>
+        <w:gridCol w:w="4824"/>
+      </w:tblGrid>
+      <w:tr>
+        <w:tc>
+          <w:tcPr>
+            <w:tcW w:type="dxa" w:w="3168"/>
+          </w:tcPr>
+          <w:p>
+            <w:pPr>
+              <w:jc w:val="center"/>
+            </w:pPr>
+            <w:r>
+              <w:drawing>
+                <wp:inline xmlns:a="http://schemas.openxmlformats.org/drawingml/2006/main" xmlns:pic="http://schemas.openxmlformats.org/drawingml/2006/picture">
+                  <wp:extent cx="1783080" cy="1434610"/>
+                  <wp:docPr id="1" name="Picture 1"/>
+                  <wp:cNvGraphicFramePr>
+                    <a:graphicFrameLocks noChangeAspect="1"/>
+                  </wp:cNvGraphicFramePr>
+                  <a:graphic>
+                    <a:graphicData uri="http://schemas.openxmlformats.org/drawingml/2006/picture">
+                      <pic:pic>
+                        <pic:nvPicPr>
+                          <pic:cNvPr id="0" name="charlene_portrait.png"/>
+                          <pic:cNvPicPr/>
+                        </pic:nvPicPr>
+                        <pic:blipFill>
+                          <a:blip r:embed="rId9"/>
+                          <a:stretch>
+                            <a:fillRect/>
+                          </a:stretch>
+                        </pic:blipFill>
+                        <pic:spPr>
+                          <a:xfrm>
+                            <a:off x="0" y="0"/>
+                            <a:ext cx="1783080" cy="1434610"/>
+                          </a:xfrm>
+                          <a:prstGeom prst="rect"/>
+                        </pic:spPr>
+                      </pic:pic>
+                    </a:graphicData>
+                  </a:graphic>
+                </wp:inline>
+              </w:drawing>
+            </w:r>
+          </w:p>
+          <w:p>
+            <w:pPr>
+              <w:spacing w:before="60"/>
+              <w:jc w:val="center"/>
+            </w:pPr>
+            <w:r>
+              <w:rPr>
+                <w:rFonts w:ascii="Arial" w:hAnsi="Arial"/>
+                <w:b/>
+                <w:color w:val="042F2E"/>
+                <w:sz w:val="16"/>
+              </w:rPr>
+              <w:t>Charlene Odei Asare</w:t>
+              <w:br/>
+              <w:t>Financial Secretary — Elect</w:t>
+            </w:r>
+          </w:p>
+        </w:tc>
+        <w:tc>
+          <w:tcPr>
+            <w:tcW w:type="dxa" w:w="6480"/>
+          </w:tcPr>
+          <w:p>
+            <w:pPr>
+              <w:spacing w:line="300" w:lineRule="auto" w:after="160"/>
+            </w:pPr>
+            <w:r>
+              <w:rPr>
+                <w:rFonts w:ascii="Georgia" w:hAnsi="Georgia"/>
+                <w:b/>
+                <w:color w:val="0F172A"/>
+                <w:sz w:val="21"/>
+              </w:rPr>
+              <w:t>Dear Medical Students &amp; Esteemed FHUMSA Fraternity,</w:t>
+              <w:br/>
+              <w:br/>
+            </w:r>
+            <w:r>
+              <w:rPr>
+                <w:rFonts w:ascii="Georgia" w:hAnsi="Georgia"/>
+                <w:color w:val="0F172A"/>
+                <w:sz w:val="21"/>
+              </w:rPr>
+              <w:t>To everyone who believed, encouraged, and voted—thank you. I am deeply humbled, honored, and grateful for the overwhelming trust you have placed in me. I won't take your trust for granted.</w:t>
+              <w:br/>
+              <w:br/>
+              <w:t>Winning wasn't the finish line; it was the starting point. I step in with one mindset: WORK. SERVE. DELIVER.</w:t>
+            </w:r>
+          </w:p>
+        </w:tc>
+      </w:tr>
+    </w:tbl>
     <w:p>
       <w:pPr>
-        <w:spacing w:line="300" w:lineRule="auto" w:after="200"/>
-      </w:pPr>
-      <w:r>
-        <w:rPr>
-          <w:rFonts w:ascii="Georgia" w:hAnsi="Georgia"/>
-          <w:b/>
-          <w:color w:val="0F172A"/>
-          <w:sz w:val="22"/>
-        </w:rPr>
-        <w:t>Dear Medical Students &amp; Esteemed FHUMSA Fraternity,</w:t>
-        <w:br/>
-        <w:br/>
-      </w:r>
-      <w:r>
-        <w:rPr>
-          <w:rFonts w:ascii="Georgia" w:hAnsi="Georgia"/>
-          <w:i w:val="0"/>
-          <w:color w:val="0F172A"/>
-          <w:sz w:val="22"/>
-        </w:rPr>
-        <w:t>To the entire student body of Family Health University Medical School, our faculty, and every colleague who believed, encouraged, and voted:</w:t>
-      </w:r>
-    </w:p>
-    <w:p>
-      <w:pPr>
-        <w:spacing w:line="300" w:lineRule="auto" w:after="200"/>
-      </w:pPr>
-      <w:r>
-        <w:rPr>
-          <w:rFonts w:ascii="Georgia" w:hAnsi="Georgia"/>
-          <w:i w:val="0"/>
-          <w:color w:val="0F172A"/>
-          <w:sz w:val="22"/>
-        </w:rPr>
-        <w:t>To everyone who believed, encouraged, and voted—thank you. I am deeply humbled and honored by the overwhelming support. I won't take your trust for granted.</w:t>
-      </w:r>
-    </w:p>
-    <w:p>
-      <w:pPr>
-        <w:spacing w:before="200" w:after="240"/>
+        <w:spacing w:before="200" w:after="200"/>
         <w:jc w:val="center"/>
       </w:pPr>
       <w:r>
@@ -157,44 +225,28 @@
           <w:b/>
           <w:i/>
           <w:color w:val="0D766E"/>
-          <w:sz w:val="24"/>
+          <w:sz w:val="23"/>
         </w:rPr>
-        <w:t>"Winning wasn't the finish line; it was the starting point.</w:t>
-        <w:br/>
-        <w:t>I step in with one mindset: WORK. SERVE. DELIVER."</w:t>
+        <w:t>“I want my tenure felt, not just remembered. Seen, not just promised.”</w:t>
       </w:r>
     </w:p>
     <w:p>
       <w:pPr>
-        <w:spacing w:line="300" w:lineRule="auto" w:after="200"/>
+        <w:spacing w:line="300" w:lineRule="auto" w:after="160"/>
       </w:pPr>
       <w:r>
         <w:rPr>
           <w:rFonts w:ascii="Georgia" w:hAnsi="Georgia"/>
           <w:i w:val="0"/>
           <w:color w:val="0F172A"/>
-          <w:sz w:val="22"/>
+          <w:sz w:val="21"/>
         </w:rPr>
-        <w:t>I want my tenure felt, not just remembered. Seen, not just promised.</w:t>
+        <w:t>FHUMSA, you gave me the mandate; now watch me put it to work. Our commitment to transparency, student welfare, and prudent financial management begins today.</w:t>
       </w:r>
     </w:p>
     <w:p>
       <w:pPr>
-        <w:spacing w:line="300" w:lineRule="auto" w:after="200"/>
-      </w:pPr>
-      <w:r>
-        <w:rPr>
-          <w:rFonts w:ascii="Georgia" w:hAnsi="Georgia"/>
-          <w:i w:val="0"/>
-          <w:color w:val="0F172A"/>
-          <w:sz w:val="22"/>
-        </w:rPr>
-        <w:t>FHUMSA, you gave me the mandate; now watch me put it to work.</w:t>
-      </w:r>
-    </w:p>
-    <w:p>
-      <w:pPr>
-        <w:spacing w:before="240" w:after="320"/>
+        <w:spacing w:before="200" w:after="280"/>
         <w:jc w:val="center"/>
       </w:pPr>
       <w:r>
@@ -202,20 +254,20 @@
           <w:rFonts w:ascii="Arial" w:hAnsi="Arial"/>
           <w:b/>
           <w:color w:val="D97706"/>
-          <w:sz w:val="23"/>
+          <w:sz w:val="22"/>
         </w:rPr>
         <w:t>CAMPAIGN OVER. SERVICE BEGINS.</w:t>
       </w:r>
     </w:p>
     <w:p>
       <w:pPr>
-        <w:spacing w:after="60"/>
+        <w:spacing w:after="40"/>
       </w:pPr>
       <w:r>
         <w:rPr>
           <w:rFonts w:ascii="Georgia" w:hAnsi="Georgia"/>
           <w:color w:val="0F172A"/>
-          <w:sz w:val="22"/>
+          <w:sz w:val="21"/>
         </w:rPr>
         <w:t>Yours in Dedicated Service,</w:t>
         <w:br/>
@@ -226,7 +278,7 @@
           <w:rFonts w:ascii="Georgia" w:hAnsi="Georgia"/>
           <w:b/>
           <w:color w:val="042F2E"/>
-          <w:sz w:val="24"/>
+          <w:sz w:val="23"/>
         </w:rPr>
         <w:t>Charlene Odei Asare</w:t>
         <w:br/>
@@ -235,7 +287,7 @@
         <w:rPr>
           <w:rFonts w:ascii="Arial" w:hAnsi="Arial"/>
           <w:color w:val="475569"/>
-          <w:sz w:val="19"/>
+          <w:sz w:val="18"/>
         </w:rPr>
         <w:t>Financial Secretary — Elect</w:t>
         <w:br/>
@@ -246,7 +298,7 @@
     </w:p>
     <w:p>
       <w:pPr>
-        <w:spacing w:before="320"/>
+        <w:spacing w:before="240"/>
         <w:jc w:val="center"/>
       </w:pPr>
       <w:r>
@@ -260,7 +312,7 @@
     </w:p>
     <w:sectPr>
       <w:pgSz w:w="12240" w:h="15840"/>
-      <w:pgMar w:top="1440" w:right="1440" w:bottom="1440" w:left="1440" w:header="720" w:footer="720" w:gutter="0"/>
+      <w:pgMar w:top="1224" w:right="1296" w:bottom="1224" w:left="1296" w:header="720" w:footer="720" w:gutter="0"/>
       <w:cols w:space="720"/>
       <w:docGrid w:linePitch="360"/>
     </w:sectPr>

</xml_diff>

<commit_message>
Update FHUMSA press statement to official Ghanaian parliamentary letterhead format with no portrait and bottom phone bar
</commit_message>
<xml_diff>
--- a/FHUMSA_Press_Release_Charlene_Odei_Asare.docx
+++ b/FHUMSA_Press_Release_Charlene_Odei_Asare.docx
@@ -2,111 +2,6 @@
 <file path=word/document.xml><?xml version="1.0" encoding="utf-8"?>
 <w:document xmlns:wpc="http://schemas.microsoft.com/office/word/2010/wordprocessingCanvas" xmlns:mo="http://schemas.microsoft.com/office/mac/office/2008/main" xmlns:mc="http://schemas.openxmlformats.org/markup-compatibility/2006" xmlns:mv="urn:schemas-microsoft-com:mac:vml" xmlns:o="urn:schemas-microsoft-com:office:office" xmlns:r="http://schemas.openxmlformats.org/officeDocument/2006/relationships" xmlns:m="http://schemas.openxmlformats.org/officeDocument/2006/math" xmlns:v="urn:schemas-microsoft-com:vml" xmlns:wp14="http://schemas.microsoft.com/office/word/2010/wordprocessingDrawing" xmlns:wp="http://schemas.openxmlformats.org/drawingml/2006/wordprocessingDrawing" xmlns:w10="urn:schemas-microsoft-com:office:word" xmlns:w="http://schemas.openxmlformats.org/wordprocessingml/2006/main" xmlns:w14="http://schemas.microsoft.com/office/word/2010/wordml" xmlns:wpg="http://schemas.microsoft.com/office/word/2010/wordprocessingGroup" xmlns:wpi="http://schemas.microsoft.com/office/word/2010/wordprocessingInk" xmlns:wne="http://schemas.microsoft.com/office/word/2006/wordml" xmlns:wps="http://schemas.microsoft.com/office/word/2010/wordprocessingShape" mc:Ignorable="w14 wp14">
   <w:body>
-    <w:p>
-      <w:pPr>
-        <w:spacing w:after="40"/>
-        <w:jc w:val="center"/>
-      </w:pPr>
-      <w:r>
-        <w:rPr>
-          <w:rFonts w:ascii="Georgia" w:hAnsi="Georgia"/>
-          <w:b/>
-          <w:color w:val="042F2E"/>
-          <w:sz w:val="26"/>
-        </w:rPr>
-        <w:t>FAMILY HEALTH UNIVERSITY MEDICAL SCHOOL</w:t>
-        <w:br/>
-      </w:r>
-      <w:r>
-        <w:rPr>
-          <w:rFonts w:ascii="Georgia" w:hAnsi="Georgia"/>
-          <w:b/>
-          <w:color w:val="0D766E"/>
-          <w:sz w:val="22"/>
-        </w:rPr>
-        <w:t>MEDICAL STUDENTS' ASSOCIATION (FHUMSA)</w:t>
-        <w:br/>
-      </w:r>
-      <w:r>
-        <w:rPr>
-          <w:rFonts w:ascii="Arial" w:hAnsi="Arial"/>
-          <w:b/>
-          <w:color w:val="D97706"/>
-          <w:sz w:val="19"/>
-        </w:rPr>
-        <w:t>OFFICE OF THE FINANCIAL SECRETARY — ELECT</w:t>
-        <w:br/>
-      </w:r>
-      <w:r>
-        <w:rPr>
-          <w:rFonts w:ascii="Arial" w:hAnsi="Arial"/>
-          <w:color w:val="475569"/>
-          <w:sz w:val="17"/>
-        </w:rPr>
-        <w:t>Family Health University College · P.O. Box TS 669, Teshie, Accra, Ghana</w:t>
-        <w:br/>
-      </w:r>
-    </w:p>
-    <w:p>
-      <w:pPr>
-        <w:spacing w:after="200"/>
-        <w:jc w:val="center"/>
-        <w:pBdr>
-          <w:bottom w:val="single" w:sz="18" w:space="1" w:color="0D766E"/>
-        </w:pBdr>
-      </w:pPr>
-    </w:p>
-    <w:p>
-      <w:pPr>
-        <w:spacing w:after="200"/>
-      </w:pPr>
-      <w:r>
-        <w:rPr>
-          <w:rFonts w:ascii="Arial" w:hAnsi="Arial"/>
-          <w:b/>
-          <w:color w:val="D97706"/>
-          <w:sz w:val="19"/>
-        </w:rPr>
-        <w:t>FOR IMMEDIATE RELEASE</w:t>
-        <w:br/>
-      </w:r>
-      <w:r>
-        <w:rPr>
-          <w:rFonts w:ascii="Arial" w:hAnsi="Arial"/>
-          <w:b/>
-          <w:color w:val="0F172A"/>
-          <w:sz w:val="18"/>
-        </w:rPr>
-        <w:t>DATE: August 2026</w:t>
-        <w:br/>
-      </w:r>
-      <w:r>
-        <w:rPr>
-          <w:rFonts w:ascii="Arial" w:hAnsi="Arial"/>
-          <w:color w:val="475569"/>
-          <w:sz w:val="18"/>
-        </w:rPr>
-        <w:t>SUBJECT: Official Post-Election Appreciation &amp; Acceptance Statement</w:t>
-        <w:br/>
-        <w:t>ISSUED BY: Charlene Odei Asare, Financial Secretary — Elect</w:t>
-        <w:br/>
-      </w:r>
-    </w:p>
-    <w:p>
-      <w:pPr>
-        <w:spacing w:before="80" w:after="280"/>
-        <w:jc w:val="center"/>
-      </w:pPr>
-      <w:r>
-        <w:rPr>
-          <w:rFonts w:ascii="Georgia" w:hAnsi="Georgia"/>
-          <w:b/>
-          <w:color w:val="042F2E"/>
-          <w:sz w:val="30"/>
-        </w:rPr>
-        <w:t>WE DID IT: A MANDATE FOR SERVICE &amp; IMPACT</w:t>
-      </w:r>
-    </w:p>
     <w:tbl>
       <w:tblPr>
         <w:tblW w:type="auto" w:w="0"/>
@@ -115,22 +10,23 @@
         <w:tblLook w:firstColumn="1" w:firstRow="1" w:lastColumn="0" w:lastRow="0" w:noHBand="0" w:noVBand="1" w:val="04A0"/>
       </w:tblPr>
       <w:tblGrid>
-        <w:gridCol w:w="4824"/>
-        <w:gridCol w:w="4824"/>
+        <w:gridCol w:w="4896"/>
+        <w:gridCol w:w="4896"/>
       </w:tblGrid>
       <w:tr>
         <w:tc>
           <w:tcPr>
-            <w:tcW w:type="dxa" w:w="3168"/>
+            <w:tcW w:type="dxa" w:w="2160"/>
+            <w:vAlign w:val="center"/>
           </w:tcPr>
           <w:p>
             <w:pPr>
-              <w:jc w:val="center"/>
+              <w:jc w:val="left"/>
             </w:pPr>
             <w:r>
               <w:drawing>
                 <wp:inline xmlns:a="http://schemas.openxmlformats.org/drawingml/2006/main" xmlns:pic="http://schemas.openxmlformats.org/drawingml/2006/picture">
-                  <wp:extent cx="1783080" cy="1434610"/>
+                  <wp:extent cx="1143000" cy="926945"/>
                   <wp:docPr id="1" name="Picture 1"/>
                   <wp:cNvGraphicFramePr>
                     <a:graphicFrameLocks noChangeAspect="1"/>
@@ -139,7 +35,7 @@
                     <a:graphicData uri="http://schemas.openxmlformats.org/drawingml/2006/picture">
                       <pic:pic>
                         <pic:nvPicPr>
-                          <pic:cNvPr id="0" name="charlene_portrait.png"/>
+                          <pic:cNvPr id="0" name="fhumsa_logo.png"/>
                           <pic:cNvPicPr/>
                         </pic:nvPicPr>
                         <pic:blipFill>
@@ -151,7 +47,7 @@
                         <pic:spPr>
                           <a:xfrm>
                             <a:off x="0" y="0"/>
-                            <a:ext cx="1783080" cy="1434610"/>
+                            <a:ext cx="1143000" cy="926945"/>
                           </a:xfrm>
                           <a:prstGeom prst="rect"/>
                         </pic:spPr>
@@ -162,53 +58,44 @@
               </w:drawing>
             </w:r>
           </w:p>
+        </w:tc>
+        <w:tc>
+          <w:tcPr>
+            <w:tcW w:type="dxa" w:w="7488"/>
+            <w:vAlign w:val="center"/>
+          </w:tcPr>
           <w:p>
             <w:pPr>
-              <w:spacing w:before="60"/>
-              <w:jc w:val="center"/>
+              <w:spacing w:line="276" w:lineRule="auto" w:after="0"/>
             </w:pPr>
+            <w:r>
+              <w:rPr>
+                <w:rFonts w:ascii="Arial Black" w:hAnsi="Arial Black"/>
+                <w:b/>
+                <w:color w:val="000000"/>
+                <w:sz w:val="34"/>
+              </w:rPr>
+              <w:t>MEDICAL STUDENTS' ASSOCIATION</w:t>
+              <w:br/>
+            </w:r>
             <w:r>
               <w:rPr>
                 <w:rFonts w:ascii="Arial" w:hAnsi="Arial"/>
                 <w:b/>
-                <w:color w:val="042F2E"/>
-                <w:sz w:val="16"/>
+                <w:color w:val="B91C1C"/>
+                <w:sz w:val="26"/>
               </w:rPr>
-              <w:t>Charlene Odei Asare</w:t>
-              <w:br/>
-              <w:t>Financial Secretary — Elect</w:t>
-            </w:r>
-          </w:p>
-        </w:tc>
-        <w:tc>
-          <w:tcPr>
-            <w:tcW w:type="dxa" w:w="6480"/>
-          </w:tcPr>
-          <w:p>
-            <w:pPr>
-              <w:spacing w:line="300" w:lineRule="auto" w:after="160"/>
-            </w:pPr>
-            <w:r>
-              <w:rPr>
-                <w:rFonts w:ascii="Georgia" w:hAnsi="Georgia"/>
-                <w:b/>
-                <w:color w:val="0F172A"/>
-                <w:sz w:val="21"/>
-              </w:rPr>
-              <w:t>Dear Medical Students &amp; Esteemed FHUMSA Fraternity,</w:t>
-              <w:br/>
+              <w:t>FAMILY HEALTH UNIVERSITY</w:t>
               <w:br/>
             </w:r>
             <w:r>
               <w:rPr>
-                <w:rFonts w:ascii="Georgia" w:hAnsi="Georgia"/>
-                <w:color w:val="0F172A"/>
-                <w:sz w:val="21"/>
+                <w:rFonts w:ascii="Arial" w:hAnsi="Arial"/>
+                <w:b/>
+                <w:color w:val="000000"/>
+                <w:sz w:val="19"/>
               </w:rPr>
-              <w:t>To everyone who believed, encouraged, and voted—thank you. I am deeply humbled, honored, and grateful for the overwhelming trust you have placed in me. I won't take your trust for granted.</w:t>
-              <w:br/>
-              <w:br/>
-              <w:t>Winning wasn't the finish line; it was the starting point. I step in with one mindset: WORK. SERVE. DELIVER.</w:t>
+              <w:t>Office of the Financial Secretary — Elect · Accra (Ghana)</w:t>
             </w:r>
           </w:p>
         </w:tc>
@@ -216,44 +103,157 @@
     </w:tbl>
     <w:p>
       <w:pPr>
-        <w:spacing w:before="200" w:after="200"/>
-        <w:jc w:val="center"/>
-      </w:pPr>
-      <w:r>
-        <w:rPr>
-          <w:rFonts w:ascii="Georgia" w:hAnsi="Georgia"/>
-          <w:b/>
-          <w:i/>
-          <w:color w:val="0D766E"/>
-          <w:sz w:val="23"/>
-        </w:rPr>
-        <w:t>“I want my tenure felt, not just remembered. Seen, not just promised.”</w:t>
-      </w:r>
-    </w:p>
-    <w:p>
-      <w:pPr>
-        <w:spacing w:line="300" w:lineRule="auto" w:after="160"/>
-      </w:pPr>
-      <w:r>
-        <w:rPr>
-          <w:rFonts w:ascii="Georgia" w:hAnsi="Georgia"/>
-          <w:i w:val="0"/>
-          <w:color w:val="0F172A"/>
-          <w:sz w:val="21"/>
-        </w:rPr>
-        <w:t>FHUMSA, you gave me the mandate; now watch me put it to work. Our commitment to transparency, student welfare, and prudent financial management begins today.</w:t>
-      </w:r>
-    </w:p>
-    <w:p>
-      <w:pPr>
-        <w:spacing w:before="200" w:after="280"/>
+        <w:spacing w:before="320" w:after="80"/>
         <w:jc w:val="center"/>
       </w:pPr>
       <w:r>
         <w:rPr>
           <w:rFonts w:ascii="Arial" w:hAnsi="Arial"/>
           <w:b/>
-          <w:color w:val="D97706"/>
+          <w:color w:val="000000"/>
+          <w:sz w:val="23"/>
+        </w:rPr>
+        <w:t>OFFICIAL ACCEPTANCE &amp; APPRECIATION STATEMENT ON THE 2026 FHUMSA GENERAL ELECTIONS</w:t>
+      </w:r>
+    </w:p>
+    <w:p>
+      <w:pPr>
+        <w:spacing w:before="0" w:after="200"/>
+        <w:jc w:val="center"/>
+      </w:pPr>
+      <w:r>
+        <w:rPr>
+          <w:rFonts w:ascii="Georgia" w:hAnsi="Georgia"/>
+          <w:i/>
+          <w:color w:val="0F172A"/>
+          <w:sz w:val="20"/>
+        </w:rPr>
+        <w:t>Friday, 21st August 2026</w:t>
+      </w:r>
+    </w:p>
+    <w:p>
+      <w:pPr>
+        <w:spacing w:after="240"/>
+        <w:pBdr>
+          <w:bottom w:val="single" w:sz="12" w:space="1" w:color="000000"/>
+        </w:pBdr>
+      </w:pPr>
+    </w:p>
+    <w:p>
+      <w:pPr>
+        <w:spacing w:line="288" w:lineRule="auto" w:after="180"/>
+        <w:jc w:val="both"/>
+      </w:pPr>
+      <w:r>
+        <w:rPr>
+          <w:rFonts w:ascii="Times New Roman" w:hAnsi="Times New Roman"/>
+          <w:color w:val="000000"/>
+          <w:sz w:val="22"/>
+        </w:rPr>
+        <w:t>Following the successful conclusion of the 2026 Family Health University Medical Students’ Association (FHUMSA) General Elections, the newly elected Financial Secretary, Charlene Odei Asare, issues this official statement of appreciation and commitment to the entire student body and fraternity.</w:t>
+      </w:r>
+    </w:p>
+    <w:p>
+      <w:pPr>
+        <w:spacing w:line="288" w:lineRule="auto" w:after="180"/>
+        <w:jc w:val="both"/>
+      </w:pPr>
+      <w:r>
+        <w:rPr>
+          <w:rFonts w:ascii="Times New Roman" w:hAnsi="Times New Roman"/>
+          <w:b/>
+          <w:color w:val="000000"/>
+          <w:sz w:val="22"/>
+        </w:rPr>
+        <w:t xml:space="preserve">WE DID IT. </w:t>
+      </w:r>
+      <w:r>
+        <w:rPr>
+          <w:rFonts w:ascii="Times New Roman" w:hAnsi="Times New Roman"/>
+          <w:color w:val="000000"/>
+          <w:sz w:val="22"/>
+        </w:rPr>
+        <w:t>To everyone who believed, encouraged, and voted—thank you. I am deeply humbled and honored by the overwhelming support. I won't take your trust for granted.</w:t>
+      </w:r>
+    </w:p>
+    <w:p>
+      <w:pPr>
+        <w:spacing w:line="288" w:lineRule="auto" w:after="180"/>
+        <w:jc w:val="both"/>
+      </w:pPr>
+      <w:r>
+        <w:rPr>
+          <w:rFonts w:ascii="Times New Roman" w:hAnsi="Times New Roman"/>
+          <w:b/>
+          <w:color w:val="000000"/>
+          <w:sz w:val="22"/>
+        </w:rPr>
+        <w:t xml:space="preserve">First, the mandate is clear. </w:t>
+      </w:r>
+      <w:r>
+        <w:rPr>
+          <w:rFonts w:ascii="Times New Roman" w:hAnsi="Times New Roman"/>
+          <w:color w:val="000000"/>
+          <w:sz w:val="22"/>
+        </w:rPr>
+        <w:t>Winning wasn’t the finish line; it was the starting point. I step into this office with one unwavering mindset: WORK. SERVE. DELIVER.</w:t>
+      </w:r>
+    </w:p>
+    <w:p>
+      <w:pPr>
+        <w:spacing w:line="288" w:lineRule="auto" w:after="180"/>
+        <w:jc w:val="both"/>
+      </w:pPr>
+      <w:r>
+        <w:rPr>
+          <w:rFonts w:ascii="Times New Roman" w:hAnsi="Times New Roman"/>
+          <w:b/>
+          <w:color w:val="000000"/>
+          <w:sz w:val="22"/>
+        </w:rPr>
+        <w:t xml:space="preserve">Second, our accountability begins immediately. </w:t>
+      </w:r>
+      <w:r>
+        <w:rPr>
+          <w:rFonts w:ascii="Times New Roman" w:hAnsi="Times New Roman"/>
+          <w:color w:val="000000"/>
+          <w:sz w:val="22"/>
+        </w:rPr>
+        <w:t>I want my tenure felt, not just remembered. Seen in tangible improvements, transparent financial stewardship, and prudent resource management—not just promised on campaign platforms.</w:t>
+      </w:r>
+    </w:p>
+    <w:p>
+      <w:pPr>
+        <w:spacing w:line="288" w:lineRule="auto" w:after="180"/>
+        <w:jc w:val="both"/>
+      </w:pPr>
+      <w:r>
+        <w:rPr>
+          <w:rFonts w:ascii="Times New Roman" w:hAnsi="Times New Roman"/>
+          <w:b/>
+          <w:color w:val="000000"/>
+          <w:sz w:val="22"/>
+        </w:rPr>
+        <w:t xml:space="preserve">Third, we build together. </w:t>
+      </w:r>
+      <w:r>
+        <w:rPr>
+          <w:rFonts w:ascii="Times New Roman" w:hAnsi="Times New Roman"/>
+          <w:color w:val="000000"/>
+          <w:sz w:val="22"/>
+        </w:rPr>
+        <w:t>FHUMSA, you gave me the mandate; now watch me put it to work. We are committed to serving every medical student with integrity, diligence, and dedication.</w:t>
+      </w:r>
+    </w:p>
+    <w:p>
+      <w:pPr>
+        <w:spacing w:line="288" w:lineRule="auto" w:after="180"/>
+        <w:jc w:val="both"/>
+      </w:pPr>
+      <w:r>
+        <w:rPr>
+          <w:rFonts w:ascii="Times New Roman" w:hAnsi="Times New Roman"/>
+          <w:color w:val="000000"/>
           <w:sz w:val="22"/>
         </w:rPr>
         <w:t>CAMPAIGN OVER. SERVICE BEGINS.</w:t>
@@ -261,58 +261,90 @@
     </w:p>
     <w:p>
       <w:pPr>
-        <w:spacing w:after="40"/>
+        <w:spacing w:before="200" w:after="0"/>
+      </w:pPr>
+      <w:r>
+        <w:drawing>
+          <wp:inline xmlns:a="http://schemas.openxmlformats.org/drawingml/2006/main" xmlns:pic="http://schemas.openxmlformats.org/drawingml/2006/picture">
+            <wp:extent cx="1645920" cy="462915"/>
+            <wp:docPr id="2" name="Picture 2"/>
+            <wp:cNvGraphicFramePr>
+              <a:graphicFrameLocks noChangeAspect="1"/>
+            </wp:cNvGraphicFramePr>
+            <a:graphic>
+              <a:graphicData uri="http://schemas.openxmlformats.org/drawingml/2006/picture">
+                <pic:pic>
+                  <pic:nvPicPr>
+                    <pic:cNvPr id="0" name="charlene_signature.png"/>
+                    <pic:cNvPicPr/>
+                  </pic:nvPicPr>
+                  <pic:blipFill>
+                    <a:blip r:embed="rId10"/>
+                    <a:stretch>
+                      <a:fillRect/>
+                    </a:stretch>
+                  </pic:blipFill>
+                  <pic:spPr>
+                    <a:xfrm>
+                      <a:off x="0" y="0"/>
+                      <a:ext cx="1645920" cy="462915"/>
+                    </a:xfrm>
+                    <a:prstGeom prst="rect"/>
+                  </pic:spPr>
+                </pic:pic>
+              </a:graphicData>
+            </a:graphic>
+          </wp:inline>
+        </w:drawing>
+      </w:r>
+    </w:p>
+    <w:p>
+      <w:pPr>
+        <w:spacing w:after="400"/>
       </w:pPr>
       <w:r>
         <w:rPr>
-          <w:rFonts w:ascii="Georgia" w:hAnsi="Georgia"/>
-          <w:color w:val="0F172A"/>
-          <w:sz w:val="21"/>
+          <w:rFonts w:ascii="Arial" w:hAnsi="Arial"/>
+          <w:b/>
+          <w:color w:val="000000"/>
+          <w:sz w:val="22"/>
         </w:rPr>
-        <w:t>Yours in Dedicated Service,</w:t>
-        <w:br/>
-        <w:br/>
-      </w:r>
-      <w:r>
-        <w:rPr>
-          <w:rFonts w:ascii="Georgia" w:hAnsi="Georgia"/>
-          <w:b/>
-          <w:color w:val="042F2E"/>
-          <w:sz w:val="23"/>
-        </w:rPr>
-        <w:t>Charlene Odei Asare</w:t>
+        <w:t>CHARLENE ODEI ASARE</w:t>
         <w:br/>
       </w:r>
       <w:r>
         <w:rPr>
           <w:rFonts w:ascii="Arial" w:hAnsi="Arial"/>
-          <w:color w:val="475569"/>
-          <w:sz w:val="18"/>
+          <w:b/>
+          <w:color w:val="000000"/>
+          <w:sz w:val="19"/>
         </w:rPr>
-        <w:t>Financial Secretary — Elect</w:t>
+        <w:t>FINANCIAL SECRETARY — ELECT</w:t>
         <w:br/>
-        <w:t>Family Health University Medical Students' Association (FHUMSA)</w:t>
-        <w:br/>
-        <w:t>Family Health University College, Teshie, Accra, Ghana</w:t>
+        <w:t>FAMILY HEALTH UNIVERSITY MEDICAL STUDENTS' ASSOCIATION (FHUMSA)</w:t>
       </w:r>
     </w:p>
     <w:p>
       <w:pPr>
-        <w:spacing w:before="240"/>
+        <w:spacing w:before="320"/>
         <w:jc w:val="center"/>
+        <w:pBdr>
+          <w:top w:val="single" w:sz="18" w:space="4" w:color="B91C1C"/>
+        </w:pBdr>
       </w:pPr>
       <w:r>
         <w:rPr>
           <w:rFonts w:ascii="Arial" w:hAnsi="Arial"/>
           <w:b/>
-          <w:color w:val="475569"/>
+          <w:color w:val="000000"/>
+          <w:sz w:val="20"/>
         </w:rPr>
-        <w:t>###</w:t>
+        <w:t xml:space="preserve">  +233 24 563 6351 / 0245636351  ·  fhumsa@fhu.edu.gh</w:t>
       </w:r>
     </w:p>
     <w:sectPr>
       <w:pgSz w:w="12240" w:h="15840"/>
-      <w:pgMar w:top="1224" w:right="1296" w:bottom="1224" w:left="1296" w:header="720" w:footer="720" w:gutter="0"/>
+      <w:pgMar w:top="1080" w:right="1224" w:bottom="1080" w:left="1224" w:header="720" w:footer="720" w:gutter="0"/>
       <w:cols w:space="720"/>
       <w:docGrid w:linePitch="360"/>
     </w:sectPr>

</xml_diff>

<commit_message>
Update FHUMSA document with official Family Health University logo, updated Appreciation Statement title, and physical signature space
</commit_message>
<xml_diff>
--- a/FHUMSA_Press_Release_Charlene_Odei_Asare.docx
+++ b/FHUMSA_Press_Release_Charlene_Odei_Asare.docx
@@ -16,7 +16,7 @@
       <w:tr>
         <w:tc>
           <w:tcPr>
-            <w:tcW w:type="dxa" w:w="2160"/>
+            <w:tcW w:type="dxa" w:w="2016"/>
             <w:vAlign w:val="center"/>
           </w:tcPr>
           <w:p>
@@ -26,7 +26,7 @@
             <w:r>
               <w:drawing>
                 <wp:inline xmlns:a="http://schemas.openxmlformats.org/drawingml/2006/main" xmlns:pic="http://schemas.openxmlformats.org/drawingml/2006/picture">
-                  <wp:extent cx="1143000" cy="926945"/>
+                  <wp:extent cx="1051560" cy="1128674"/>
                   <wp:docPr id="1" name="Picture 1"/>
                   <wp:cNvGraphicFramePr>
                     <a:graphicFrameLocks noChangeAspect="1"/>
@@ -35,7 +35,7 @@
                     <a:graphicData uri="http://schemas.openxmlformats.org/drawingml/2006/picture">
                       <pic:pic>
                         <pic:nvPicPr>
-                          <pic:cNvPr id="0" name="fhumsa_logo.png"/>
+                          <pic:cNvPr id="0" name="fhu_actual_logo.png"/>
                           <pic:cNvPicPr/>
                         </pic:nvPicPr>
                         <pic:blipFill>
@@ -47,7 +47,7 @@
                         <pic:spPr>
                           <a:xfrm>
                             <a:off x="0" y="0"/>
-                            <a:ext cx="1143000" cy="926945"/>
+                            <a:ext cx="1051560" cy="1128674"/>
                           </a:xfrm>
                           <a:prstGeom prst="rect"/>
                         </pic:spPr>
@@ -61,7 +61,7 @@
         </w:tc>
         <w:tc>
           <w:tcPr>
-            <w:tcW w:type="dxa" w:w="7488"/>
+            <w:tcW w:type="dxa" w:w="7632"/>
             <w:vAlign w:val="center"/>
           </w:tcPr>
           <w:p>
@@ -73,7 +73,7 @@
                 <w:rFonts w:ascii="Arial Black" w:hAnsi="Arial Black"/>
                 <w:b/>
                 <w:color w:val="000000"/>
-                <w:sz w:val="34"/>
+                <w:sz w:val="32"/>
               </w:rPr>
               <w:t>MEDICAL STUDENTS' ASSOCIATION</w:t>
               <w:br/>
@@ -111,9 +111,9 @@
           <w:rFonts w:ascii="Arial" w:hAnsi="Arial"/>
           <w:b/>
           <w:color w:val="000000"/>
-          <w:sz w:val="23"/>
+          <w:sz w:val="24"/>
         </w:rPr>
-        <w:t>OFFICIAL ACCEPTANCE &amp; APPRECIATION STATEMENT ON THE 2026 FHUMSA GENERAL ELECTIONS</w:t>
+        <w:t>APPRECIATION STATEMENT ON THE 2026 FHUMSA GENERAL ELECTIONS</w:t>
       </w:r>
     </w:p>
     <w:p>
@@ -261,46 +261,20 @@
     </w:p>
     <w:p>
       <w:pPr>
-        <w:spacing w:before="200" w:after="0"/>
+        <w:spacing w:before="720" w:after="80"/>
       </w:pPr>
       <w:r>
-        <w:drawing>
-          <wp:inline xmlns:a="http://schemas.openxmlformats.org/drawingml/2006/main" xmlns:pic="http://schemas.openxmlformats.org/drawingml/2006/picture">
-            <wp:extent cx="1645920" cy="462915"/>
-            <wp:docPr id="2" name="Picture 2"/>
-            <wp:cNvGraphicFramePr>
-              <a:graphicFrameLocks noChangeAspect="1"/>
-            </wp:cNvGraphicFramePr>
-            <a:graphic>
-              <a:graphicData uri="http://schemas.openxmlformats.org/drawingml/2006/picture">
-                <pic:pic>
-                  <pic:nvPicPr>
-                    <pic:cNvPr id="0" name="charlene_signature.png"/>
-                    <pic:cNvPicPr/>
-                  </pic:nvPicPr>
-                  <pic:blipFill>
-                    <a:blip r:embed="rId10"/>
-                    <a:stretch>
-                      <a:fillRect/>
-                    </a:stretch>
-                  </pic:blipFill>
-                  <pic:spPr>
-                    <a:xfrm>
-                      <a:off x="0" y="0"/>
-                      <a:ext cx="1645920" cy="462915"/>
-                    </a:xfrm>
-                    <a:prstGeom prst="rect"/>
-                  </pic:spPr>
-                </pic:pic>
-              </a:graphicData>
-            </a:graphic>
-          </wp:inline>
-        </w:drawing>
+        <w:rPr>
+          <w:rFonts w:ascii="Arial" w:hAnsi="Arial"/>
+          <w:color w:val="475569"/>
+          <w:sz w:val="20"/>
+        </w:rPr>
+        <w:t>___________________________</w:t>
       </w:r>
     </w:p>
     <w:p>
       <w:pPr>
-        <w:spacing w:after="400"/>
+        <w:spacing w:after="480"/>
       </w:pPr>
       <w:r>
         <w:rPr>
@@ -326,7 +300,7 @@
     </w:p>
     <w:p>
       <w:pPr>
-        <w:spacing w:before="320"/>
+        <w:spacing w:before="360"/>
         <w:jc w:val="center"/>
         <w:pBdr>
           <w:top w:val="single" w:sz="18" w:space="4" w:color="B91C1C"/>
@@ -339,7 +313,7 @@
           <w:color w:val="000000"/>
           <w:sz w:val="20"/>
         </w:rPr>
-        <w:t xml:space="preserve">  +233 24 563 6351 / 0245636351  ·  fhumsa@fhu.edu.gh</w:t>
+        <w:t>+233 24 563 6351 / 0245636351  ·  fhumsa@fhu.edu.gh</w:t>
       </w:r>
     </w:p>
     <w:sectPr>

</xml_diff>